<commit_message>
update topology and files
</commit_message>
<xml_diff>
--- a/GUI/参数文档.docx
+++ b/GUI/参数文档.docx
@@ -50,7 +50,7 @@
           <w:color w:val="1F2937"/>
           <w:sz w:val="18"/>
         </w:rPr>
-        <w:t>将组件拖入工作区，双击组件。</w:t>
+        <w:t>将组件拖入工作区，双击组件；选中节点或连线后按 Delete 或 Backspace 删除。</w:t>
       </w:r>
     </w:p>
     <w:p>
@@ -6882,6 +6882,22 @@
         <w:t>7. MATLAB 与仿真记录</w:t>
       </w:r>
     </w:p>
+    <w:p>
+      <w:pPr>
+        <w:pStyle w:val="Heading1"/>
+      </w:pPr>
+      <w:r>
+        <w:t>Windows 可执行文件不内置固定版本的 MATLAB Engine；启动时从检测到的最高版本 MATLAB 安装目录加载 Engine。</w:t>
+      </w:r>
+    </w:p>
+    <w:p>
+      <w:pPr>
+        <w:pStyle w:val="ListNumber"/>
+      </w:pPr>
+      <w:r>
+        <w:t>组件级状态日志使用同类型组件编号，格式为“组件名+编号”，例如 ONURxDSP1、ONURxDSP2。</w:t>
+      </w:r>
+    </w:p>
     <w:tbl>
       <w:tblPr>
         <w:tblStyle w:val="TableGrid"/>
@@ -7197,6 +7213,701 @@
           <w:sz w:val="18"/>
         </w:rPr>
         <w:t>检查启用扫描项的节点、参数、范围和非零步长。</w:t>
+      </w:r>
+    </w:p>
+    <w:p>
+      <w:pPr>
+        <w:pStyle w:val="Heading1"/>
+      </w:pPr>
+      <w:r>
+        <w:t>9. 实测带宽数据集</w:t>
+      </w:r>
+    </w:p>
+    <w:p>
+      <w:pPr>
+        <w:pStyle w:val="ListNumber"/>
+      </w:pPr>
+      <w:r>
+        <w:t>双击工作区中的 Modulator 或 ICR，在参数窗口的“带宽模型”区域单击“导入实测数据...”。</w:t>
+      </w:r>
+    </w:p>
+    <w:p>
+      <w:pPr>
+        <w:pStyle w:val="ListNumber"/>
+      </w:pPr>
+      <w:r>
+        <w:t>选择调制器或相干接收机，按 XI、XQ、YI、YQ 顺序指定 4 个 XLSX、CSV、TSV 或 TXT 文件。</w:t>
+      </w:r>
+    </w:p>
+    <w:p>
+      <w:pPr>
+        <w:pStyle w:val="ListNumber"/>
+      </w:pPr>
+      <w:r>
+        <w:t>设置频率列、响应列和频率单位；XLSX 读取首个工作表，列号从 1 开始。</w:t>
+      </w:r>
+    </w:p>
+    <w:p>
+      <w:pPr>
+        <w:pStyle w:val="ListNumber"/>
+      </w:pPr>
+      <w:r>
+        <w:t>选择是否按 0.5–2 GHz 中位数归一化，单击“读取并预览”；文件在后台读取，小进度条在读取期间显示，完成后检查曲线、点数、频率范围和 -3 dB 带宽。</w:t>
+      </w:r>
+    </w:p>
+    <w:p>
+      <w:pPr>
+        <w:pStyle w:val="ListNumber"/>
+      </w:pPr>
+      <w:r>
+        <w:t>单击“确认导入”写入数据集；读取失败或取消时不写入目录，也不修改组件参数。</w:t>
+      </w:r>
+    </w:p>
+    <w:tbl>
+      <w:tblPr>
+        <w:tblStyle w:val="TableGrid"/>
+        <w:tblW w:type="auto" w:w="0"/>
+        <w:tblLayout w:type="fixed"/>
+        <w:tblLook w:firstColumn="1" w:firstRow="1" w:lastColumn="0" w:lastRow="0" w:noHBand="0" w:noVBand="1" w:val="04A0"/>
+      </w:tblPr>
+      <w:tblGrid>
+        <w:gridCol w:w="3456"/>
+        <w:gridCol w:w="3456"/>
+        <w:gridCol w:w="3456"/>
+      </w:tblGrid>
+      <w:tr>
+        <w:tc>
+          <w:tcPr>
+            <w:tcW w:type="dxa" w:w="2381"/>
+            <w:vAlign w:val="center"/>
+          </w:tcPr>
+          <w:p>
+            <w:r>
+              <w:t>配置项</w:t>
+            </w:r>
+          </w:p>
+        </w:tc>
+        <w:tc>
+          <w:tcPr>
+            <w:tcW w:type="dxa" w:w="2835"/>
+            <w:vAlign w:val="center"/>
+          </w:tcPr>
+          <w:p>
+            <w:r>
+              <w:t>取值</w:t>
+            </w:r>
+          </w:p>
+        </w:tc>
+        <w:tc>
+          <w:tcPr>
+            <w:tcW w:type="dxa" w:w="4535"/>
+            <w:vAlign w:val="center"/>
+          </w:tcPr>
+          <w:p>
+            <w:r>
+              <w:t>功能</w:t>
+            </w:r>
+          </w:p>
+        </w:tc>
+      </w:tr>
+      <w:tr>
+        <w:tc>
+          <w:tcPr>
+            <w:tcW w:type="dxa" w:w="2381"/>
+            <w:vAlign w:val="center"/>
+          </w:tcPr>
+          <w:p>
+            <w:r>
+              <w:t>BandwidthModel</w:t>
+            </w:r>
+          </w:p>
+        </w:tc>
+        <w:tc>
+          <w:tcPr>
+            <w:tcW w:type="dxa" w:w="2835"/>
+            <w:vAlign w:val="center"/>
+          </w:tcPr>
+          <w:p>
+            <w:r>
+              <w:t>IdealBessel / Measured</w:t>
+            </w:r>
+          </w:p>
+        </w:tc>
+        <w:tc>
+          <w:tcPr>
+            <w:tcW w:type="dxa" w:w="4535"/>
+            <w:vAlign w:val="center"/>
+          </w:tcPr>
+          <w:p>
+            <w:r>
+              <w:t>选择代码原始 Bessel5 模型或实测幅频响应。</w:t>
+            </w:r>
+          </w:p>
+        </w:tc>
+      </w:tr>
+      <w:tr>
+        <w:tc>
+          <w:tcPr>
+            <w:tcW w:type="dxa" w:w="2381"/>
+            <w:vAlign w:val="center"/>
+          </w:tcPr>
+          <w:p>
+            <w:r>
+              <w:t>BandwidthDataset</w:t>
+            </w:r>
+          </w:p>
+        </w:tc>
+        <w:tc>
+          <w:tcPr>
+            <w:tcW w:type="dxa" w:w="2835"/>
+            <w:vAlign w:val="center"/>
+          </w:tcPr>
+          <w:p>
+            <w:r>
+              <w:t>数据集 ID</w:t>
+            </w:r>
+          </w:p>
+        </w:tc>
+        <w:tc>
+          <w:tcPr>
+            <w:tcW w:type="dxa" w:w="4535"/>
+            <w:vAlign w:val="center"/>
+          </w:tcPr>
+          <w:p>
+            <w:r>
+              <w:t>仅在 Measured 模式下引用数据集。</w:t>
+            </w:r>
+          </w:p>
+        </w:tc>
+      </w:tr>
+      <w:tr>
+        <w:tc>
+          <w:tcPr>
+            <w:tcW w:type="dxa" w:w="2381"/>
+            <w:vAlign w:val="center"/>
+          </w:tcPr>
+          <w:p>
+            <w:r>
+              <w:t>Bandwidth</w:t>
+            </w:r>
+          </w:p>
+        </w:tc>
+        <w:tc>
+          <w:tcPr>
+            <w:tcW w:type="dxa" w:w="2835"/>
+            <w:vAlign w:val="center"/>
+          </w:tcPr>
+          <w:p>
+            <w:r>
+              <w:t>Modulator 35 GHz；ICR 25 GHz</w:t>
+            </w:r>
+          </w:p>
+        </w:tc>
+        <w:tc>
+          <w:tcPr>
+            <w:tcW w:type="dxa" w:w="4535"/>
+            <w:vAlign w:val="center"/>
+          </w:tcPr>
+          <w:p>
+            <w:r>
+              <w:t>原始 Bessel5 的 -3 dB 带宽；导入数据不会改写此值。</w:t>
+            </w:r>
+          </w:p>
+        </w:tc>
+      </w:tr>
+      <w:tr>
+        <w:tc>
+          <w:tcPr>
+            <w:tcW w:type="dxa" w:w="2381"/>
+            <w:vAlign w:val="center"/>
+          </w:tcPr>
+          <w:p>
+            <w:r>
+              <w:t>频率列 / 响应列</w:t>
+            </w:r>
+          </w:p>
+        </w:tc>
+        <w:tc>
+          <w:tcPr>
+            <w:tcW w:type="dxa" w:w="2835"/>
+            <w:vAlign w:val="center"/>
+          </w:tcPr>
+          <w:p>
+            <w:r>
+              <w:t>从 1 开始</w:t>
+            </w:r>
+          </w:p>
+        </w:tc>
+        <w:tc>
+          <w:tcPr>
+            <w:tcW w:type="dxa" w:w="4535"/>
+            <w:vAlign w:val="center"/>
+          </w:tcPr>
+          <w:p>
+            <w:r>
+              <w:t>从测试文件提取频率和幅度 dB。</w:t>
+            </w:r>
+          </w:p>
+        </w:tc>
+      </w:tr>
+      <w:tr>
+        <w:tc>
+          <w:tcPr>
+            <w:tcW w:type="dxa" w:w="2381"/>
+            <w:vAlign w:val="center"/>
+          </w:tcPr>
+          <w:p>
+            <w:r>
+              <w:t>频率单位</w:t>
+            </w:r>
+          </w:p>
+        </w:tc>
+        <w:tc>
+          <w:tcPr>
+            <w:tcW w:type="dxa" w:w="2835"/>
+            <w:vAlign w:val="center"/>
+          </w:tcPr>
+          <w:p>
+            <w:r>
+              <w:t>GHz / MHz / Hz</w:t>
+            </w:r>
+          </w:p>
+        </w:tc>
+        <w:tc>
+          <w:tcPr>
+            <w:tcW w:type="dxa" w:w="4535"/>
+            <w:vAlign w:val="center"/>
+          </w:tcPr>
+          <w:p>
+            <w:r>
+              <w:t>导入后统一换算为 Hz。</w:t>
+            </w:r>
+          </w:p>
+        </w:tc>
+      </w:tr>
+      <w:tr>
+        <w:tc>
+          <w:tcPr>
+            <w:tcW w:type="dxa" w:w="2381"/>
+            <w:vAlign w:val="center"/>
+          </w:tcPr>
+          <w:p>
+            <w:r>
+              <w:t>归一化</w:t>
+            </w:r>
+          </w:p>
+        </w:tc>
+        <w:tc>
+          <w:tcPr>
+            <w:tcW w:type="dxa" w:w="2835"/>
+            <w:vAlign w:val="center"/>
+          </w:tcPr>
+          <w:p>
+            <w:r>
+              <w:t>启用 / 停用</w:t>
+            </w:r>
+          </w:p>
+        </w:tc>
+        <w:tc>
+          <w:tcPr>
+            <w:tcW w:type="dxa" w:w="4535"/>
+            <w:vAlign w:val="center"/>
+          </w:tcPr>
+          <w:p>
+            <w:r>
+              <w:t>启用时减去 0.5–2 GHz 区间幅度中位数。</w:t>
+            </w:r>
+          </w:p>
+        </w:tc>
+      </w:tr>
+    </w:tbl>
+    <w:tbl>
+      <w:tblPr>
+        <w:tblStyle w:val="TableGrid"/>
+        <w:tblW w:type="auto" w:w="0"/>
+        <w:tblLayout w:type="fixed"/>
+        <w:tblLook w:firstColumn="1" w:firstRow="1" w:lastColumn="0" w:lastRow="0" w:noHBand="0" w:noVBand="1" w:val="04A0"/>
+      </w:tblPr>
+      <w:tblGrid>
+        <w:gridCol w:w="5184"/>
+        <w:gridCol w:w="5184"/>
+      </w:tblGrid>
+      <w:tr>
+        <w:tc>
+          <w:tcPr>
+            <w:tcW w:type="dxa" w:w="4082"/>
+            <w:vAlign w:val="center"/>
+          </w:tcPr>
+          <w:p>
+            <w:r>
+              <w:t>数据字段</w:t>
+            </w:r>
+          </w:p>
+        </w:tc>
+        <w:tc>
+          <w:tcPr>
+            <w:tcW w:type="dxa" w:w="5669"/>
+            <w:vAlign w:val="center"/>
+          </w:tcPr>
+          <w:p>
+            <w:r>
+              <w:t>内容</w:t>
+            </w:r>
+          </w:p>
+        </w:tc>
+      </w:tr>
+      <w:tr>
+        <w:tc>
+          <w:tcPr>
+            <w:tcW w:type="dxa" w:w="4082"/>
+            <w:vAlign w:val="center"/>
+          </w:tcPr>
+          <w:p>
+            <w:r>
+              <w:t>lanes.XI/XQ/YI/YQ.frequency_hz</w:t>
+            </w:r>
+          </w:p>
+        </w:tc>
+        <w:tc>
+          <w:tcPr>
+            <w:tcW w:type="dxa" w:w="5669"/>
+            <w:vAlign w:val="center"/>
+          </w:tcPr>
+          <w:p>
+            <w:r>
+              <w:t>严格递增的非负频率。</w:t>
+            </w:r>
+          </w:p>
+        </w:tc>
+      </w:tr>
+      <w:tr>
+        <w:tc>
+          <w:tcPr>
+            <w:tcW w:type="dxa" w:w="4082"/>
+            <w:vAlign w:val="center"/>
+          </w:tcPr>
+          <w:p>
+            <w:r>
+              <w:t>lanes.XI/XQ/YI/YQ.magnitude_db</w:t>
+            </w:r>
+          </w:p>
+        </w:tc>
+        <w:tc>
+          <w:tcPr>
+            <w:tcW w:type="dxa" w:w="5669"/>
+            <w:vAlign w:val="center"/>
+          </w:tcPr>
+          <w:p>
+            <w:r>
+              <w:t>与频率等长的幅度响应；仿真使用线性插值并保持两端值。</w:t>
+            </w:r>
+          </w:p>
+        </w:tc>
+      </w:tr>
+      <w:tr>
+        <w:tc>
+          <w:tcPr>
+            <w:tcW w:type="dxa" w:w="4082"/>
+            <w:vAlign w:val="center"/>
+          </w:tcPr>
+          <w:p>
+            <w:r>
+              <w:t>sources[].sha256</w:t>
+            </w:r>
+          </w:p>
+        </w:tc>
+        <w:tc>
+          <w:tcPr>
+            <w:tcW w:type="dxa" w:w="5669"/>
+            <w:vAlign w:val="center"/>
+          </w:tcPr>
+          <w:p>
+            <w:r>
+              <w:t>原始测试文件 SHA-256，用于仿真可复现记录。</w:t>
+            </w:r>
+          </w:p>
+        </w:tc>
+      </w:tr>
+      <w:tr>
+        <w:tc>
+          <w:tcPr>
+            <w:tcW w:type="dxa" w:w="4082"/>
+            <w:vAlign w:val="center"/>
+          </w:tcPr>
+          <w:p>
+            <w:r>
+              <w:t>bandwidth_3db_hz</w:t>
+            </w:r>
+          </w:p>
+        </w:tc>
+        <w:tc>
+          <w:tcPr>
+            <w:tcW w:type="dxa" w:w="5669"/>
+            <w:vAlign w:val="center"/>
+          </w:tcPr>
+          <w:p>
+            <w:r>
+              <w:t>从 2 GHz 起搜索首次 -3 dB 交点并线性插值。</w:t>
+            </w:r>
+          </w:p>
+        </w:tc>
+      </w:tr>
+    </w:tbl>
+    <w:p>
+      <w:pPr>
+        <w:pStyle w:val="Heading1"/>
+      </w:pPr>
+      <w:r>
+        <w:t>10. 应用、回退与重置</w:t>
+      </w:r>
+    </w:p>
+    <w:p>
+      <w:pPr>
+        <w:pStyle w:val="ListNumber"/>
+      </w:pPr>
+      <w:r>
+        <w:t>在同一参数窗口选择“实测幅频响应”和匹配数据集，核对四通道 -3 dB 摘要后单击“确定”。</w:t>
+      </w:r>
+    </w:p>
+    <w:p>
+      <w:pPr>
+        <w:pStyle w:val="ListNumber"/>
+      </w:pPr>
+      <w:r>
+        <w:t>双击组件并选择“原始 Bessel5”，单击“确定”；该操作保留当前标量参数。</w:t>
+      </w:r>
+    </w:p>
+    <w:p>
+      <w:pPr>
+        <w:pStyle w:val="ListNumber"/>
+      </w:pPr>
+      <w:r>
+        <w:t>单击“恢复该组件默认参数”恢复该节点的代码默认参数并切回 IdealBessel。</w:t>
+      </w:r>
+    </w:p>
+    <w:p>
+      <w:pPr>
+        <w:pStyle w:val="ListNumber"/>
+      </w:pPr>
+      <w:r>
+        <w:t>选择“工具 &gt; 恢复全部默认参数”恢复全部节点参数、停用实测模型、清空全局参数和参数扫描；保留拓扑布局及数据集文件。</w:t>
+      </w:r>
+    </w:p>
+    <w:p>
+      <w:pPr>
+        <w:pStyle w:val="ListNumber"/>
+      </w:pPr>
+      <w:r>
+        <w:t>选择“工具 &gt; 重置软件状态”执行上一项操作，并清除当前仿真结果和 MATLAB 工作区缓存。</w:t>
+      </w:r>
+    </w:p>
+    <w:tbl>
+      <w:tblPr>
+        <w:tblStyle w:val="TableGrid"/>
+        <w:tblW w:type="auto" w:w="0"/>
+        <w:tblLayout w:type="fixed"/>
+        <w:tblLook w:firstColumn="1" w:firstRow="1" w:lastColumn="0" w:lastRow="0" w:noHBand="0" w:noVBand="1" w:val="04A0"/>
+      </w:tblPr>
+      <w:tblGrid>
+        <w:gridCol w:w="5184"/>
+        <w:gridCol w:w="5184"/>
+      </w:tblGrid>
+      <w:tr>
+        <w:tc>
+          <w:tcPr>
+            <w:tcW w:type="dxa" w:w="2835"/>
+            <w:vAlign w:val="center"/>
+          </w:tcPr>
+          <w:p>
+            <w:r>
+              <w:t>状态</w:t>
+            </w:r>
+          </w:p>
+        </w:tc>
+        <w:tc>
+          <w:tcPr>
+            <w:tcW w:type="dxa" w:w="6917"/>
+            <w:vAlign w:val="center"/>
+          </w:tcPr>
+          <w:p>
+            <w:r>
+              <w:t>规则</w:t>
+            </w:r>
+          </w:p>
+        </w:tc>
+      </w:tr>
+      <w:tr>
+        <w:tc>
+          <w:tcPr>
+            <w:tcW w:type="dxa" w:w="2835"/>
+            <w:vAlign w:val="center"/>
+          </w:tcPr>
+          <w:p>
+            <w:r>
+              <w:t>软件启动 / 新建设计</w:t>
+            </w:r>
+          </w:p>
+        </w:tc>
+        <w:tc>
+          <w:tcPr>
+            <w:tcW w:type="dxa" w:w="6917"/>
+            <w:vAlign w:val="center"/>
+          </w:tcPr>
+          <w:p>
+            <w:r>
+              <w:t>使用 DEFAULT_COMPONENT_PARAMS 和 IdealBessel；不自动激活上次数据集或参数。</w:t>
+            </w:r>
+          </w:p>
+        </w:tc>
+      </w:tr>
+      <w:tr>
+        <w:tc>
+          <w:tcPr>
+            <w:tcW w:type="dxa" w:w="2835"/>
+            <w:vAlign w:val="center"/>
+          </w:tcPr>
+          <w:p>
+            <w:r>
+              <w:t>打开已保存设计</w:t>
+            </w:r>
+          </w:p>
+        </w:tc>
+        <w:tc>
+          <w:tcPr>
+            <w:tcW w:type="dxa" w:w="6917"/>
+            <w:vAlign w:val="center"/>
+          </w:tcPr>
+          <w:p>
+            <w:r>
+              <w:t>按用户操作加载 nodes[].params 和 nodes[].model_config。</w:t>
+            </w:r>
+          </w:p>
+        </w:tc>
+      </w:tr>
+      <w:tr>
+        <w:tc>
+          <w:tcPr>
+            <w:tcW w:type="dxa" w:w="2835"/>
+            <w:vAlign w:val="center"/>
+          </w:tcPr>
+          <w:p>
+            <w:r>
+              <w:t>导入数据集</w:t>
+            </w:r>
+          </w:p>
+        </w:tc>
+        <w:tc>
+          <w:tcPr>
+            <w:tcW w:type="dxa" w:w="6917"/>
+            <w:vAlign w:val="center"/>
+          </w:tcPr>
+          <w:p>
+            <w:r>
+              <w:t>数据集进入目录，但不会自动应用到任何节点。</w:t>
+            </w:r>
+          </w:p>
+        </w:tc>
+      </w:tr>
+      <w:tr>
+        <w:tc>
+          <w:tcPr>
+            <w:tcW w:type="dxa" w:w="2835"/>
+            <w:vAlign w:val="center"/>
+          </w:tcPr>
+          <w:p>
+            <w:r>
+              <w:t>仿真运行</w:t>
+            </w:r>
+          </w:p>
+        </w:tc>
+        <w:tc>
+          <w:tcPr>
+            <w:tcW w:type="dxa" w:w="6917"/>
+            <w:vAlign w:val="center"/>
+          </w:tcPr>
+          <w:p>
+            <w:r>
+              <w:t>运行时解析数据集路径并生成 MATLAB 临时参数，不回写拓扑和默认参数。</w:t>
+            </w:r>
+          </w:p>
+        </w:tc>
+      </w:tr>
+      <w:tr>
+        <w:tc>
+          <w:tcPr>
+            <w:tcW w:type="dxa" w:w="2835"/>
+            <w:vAlign w:val="center"/>
+          </w:tcPr>
+          <w:p>
+            <w:r>
+              <w:t>删除数据集</w:t>
+            </w:r>
+          </w:p>
+        </w:tc>
+        <w:tc>
+          <w:tcPr>
+            <w:tcW w:type="dxa" w:w="6917"/>
+            <w:vAlign w:val="center"/>
+          </w:tcPr>
+          <w:p>
+            <w:r>
+              <w:t>正在被当前设计引用时禁止删除；删除不影响代码默认参数。</w:t>
+            </w:r>
+          </w:p>
+        </w:tc>
+      </w:tr>
+    </w:tbl>
+    <w:p>
+      <w:r>
+        <w:t>数据集目录：Windows 为 %LOCALAPPDATA%\OpticalSystemGUI\measurement_datasets；macOS 为 ~/Library/Application Support/OpticalSystemGUI/measurement_datasets。</w:t>
+      </w:r>
+    </w:p>
+    <w:p>
+      <w:pPr>
+        <w:pStyle w:val="Heading1"/>
+      </w:pPr>
+      <w:r>
+        <w:t>11. 预检查、诊断与记录</w:t>
+      </w:r>
+    </w:p>
+    <w:p>
+      <w:pPr>
+        <w:pStyle w:val="Heading1"/>
+      </w:pPr>
+      <w:r>
+        <w:t>断开后重新选择 MATLAB 根目录时保留已完整加载的 Engine 模块，只清理导入失败留下的部分模块。</w:t>
+      </w:r>
+    </w:p>
+    <w:p>
+      <w:pPr>
+        <w:pStyle w:val="ListNumber"/>
+      </w:pPr>
+      <w:r>
+        <w:t>仿真预检查验证数据集存在、格式有效、包含四通道且设备类型与节点匹配。</w:t>
+      </w:r>
+    </w:p>
+    <w:p>
+      <w:pPr>
+        <w:pStyle w:val="ListNumber"/>
+      </w:pPr>
+      <w:r>
+        <w:t>“工具 &gt; MATLAB 诊断”显示数据集目录、数量、ID、设备类型和文件位置。</w:t>
+      </w:r>
+    </w:p>
+    <w:p>
+      <w:pPr>
+        <w:pStyle w:val="ListNumber"/>
+      </w:pPr>
+      <w:r>
+        <w:t>仿真记录的 measurement_datasets 字段保存数据集 ID、名称、设备类型、归一化方式和源文件 SHA-256。</w:t>
+      </w:r>
+    </w:p>
+    <w:p>
+      <w:pPr>
+        <w:pStyle w:val="ListNumber"/>
+      </w:pPr>
+      <w:r>
+        <w:t>导入、切换、回退、恢复或删除数据集后清除 MATLAB 实测响应缓存；数据集文件不随缓存清理删除。</w:t>
       </w:r>
     </w:p>
     <w:sectPr>

</xml_diff>